<commit_message>
requirements gathering + new update in documenation file
</commit_message>
<xml_diff>
--- a/documentation/Tamenny Documentation.docx
+++ b/documentation/Tamenny Documentation.docx
@@ -99,10 +99,7 @@
       </w:r>
       <w:proofErr w:type="spellEnd"/>
       <w:r>
-        <w:t xml:space="preserve"> is a multi-channel phishing and scam detection platform designed to help non-technical users verify suspicious messages received through</w:t>
-      </w:r>
-      <w:r>
-        <w:t>:</w:t>
+        <w:t xml:space="preserve"> is a multi-channel phishing and scam detection platform designed to help non-technical users verify suspicious messages received through:</w:t>
       </w:r>
     </w:p>
     <w:p>
@@ -489,10 +486,7 @@
         </w:numPr>
       </w:pPr>
       <w:r>
-        <w:t>Tech</w:t>
-      </w:r>
-      <w:r>
-        <w:t>nical Analysis Engine</w:t>
+        <w:t>Technical Analysis Engine</w:t>
       </w:r>
     </w:p>
     <w:p>
@@ -624,6 +618,9 @@
         <w:t>Tamenny</w:t>
       </w:r>
       <w:proofErr w:type="spellEnd"/>
+      <w:r>
+        <w:t xml:space="preserve"> website</w:t>
+      </w:r>
     </w:p>
     <w:p>
       <w:pPr>
@@ -655,7 +652,15 @@
         </w:numPr>
       </w:pPr>
       <w:r>
-        <w:t>User forwards message using provided method</w:t>
+        <w:t xml:space="preserve">User download and upload the message to </w:t>
+      </w:r>
+      <w:proofErr w:type="spellStart"/>
+      <w:r>
+        <w:t>Tammeny</w:t>
+      </w:r>
+      <w:proofErr w:type="spellEnd"/>
+      <w:r>
+        <w:t xml:space="preserve"> </w:t>
       </w:r>
     </w:p>
     <w:p>
@@ -700,7 +705,7 @@
         <w:spacing w:after="240"/>
       </w:pPr>
       <w:r>
-        <w:t>Detailed report inside app</w:t>
+        <w:t>Detailed report inside website</w:t>
       </w:r>
     </w:p>
     <w:p>
@@ -805,10 +810,7 @@
         </w:numPr>
       </w:pPr>
       <w:r>
-        <w:t>Sender-domai</w:t>
-      </w:r>
-      <w:r>
-        <w:t>n comparison</w:t>
+        <w:t>Sender-domain comparison</w:t>
       </w:r>
     </w:p>
     <w:p>
@@ -1077,12 +1079,7 @@
         </w:numPr>
       </w:pPr>
       <w:r>
-        <w:t>Relay chain a</w:t>
-      </w:r>
-      <w:bookmarkStart w:id="13" w:name="_GoBack"/>
-      <w:bookmarkEnd w:id="13"/>
-      <w:r>
-        <w:t>nomalies</w:t>
+        <w:t>Relay chain anomalies</w:t>
       </w:r>
     </w:p>
     <w:p>
@@ -1110,8 +1107,8 @@
           <w:szCs w:val="34"/>
         </w:rPr>
       </w:pPr>
-      <w:bookmarkStart w:id="14" w:name="_raj9xcebx1eu" w:colFirst="0" w:colLast="0"/>
-      <w:bookmarkEnd w:id="14"/>
+      <w:bookmarkStart w:id="13" w:name="_raj9xcebx1eu" w:colFirst="0" w:colLast="0"/>
+      <w:bookmarkEnd w:id="13"/>
       <w:r>
         <w:rPr>
           <w:b/>
@@ -1198,8 +1195,8 @@
           <w:szCs w:val="34"/>
         </w:rPr>
       </w:pPr>
-      <w:bookmarkStart w:id="15" w:name="_jbjft6tpv5qy" w:colFirst="0" w:colLast="0"/>
-      <w:bookmarkEnd w:id="15"/>
+      <w:bookmarkStart w:id="14" w:name="_jbjft6tpv5qy" w:colFirst="0" w:colLast="0"/>
+      <w:bookmarkEnd w:id="14"/>
       <w:r>
         <w:rPr>
           <w:b/>
@@ -1287,8 +1284,8 @@
           <w:szCs w:val="46"/>
         </w:rPr>
       </w:pPr>
-      <w:bookmarkStart w:id="16" w:name="_arcaq9wkkzje" w:colFirst="0" w:colLast="0"/>
-      <w:bookmarkEnd w:id="16"/>
+      <w:bookmarkStart w:id="15" w:name="_arcaq9wkkzje" w:colFirst="0" w:colLast="0"/>
+      <w:bookmarkEnd w:id="15"/>
       <w:r>
         <w:rPr>
           <w:b/>
@@ -1312,8 +1309,8 @@
           <w:szCs w:val="34"/>
         </w:rPr>
       </w:pPr>
-      <w:bookmarkStart w:id="17" w:name="_38xx50h8on8i" w:colFirst="0" w:colLast="0"/>
-      <w:bookmarkEnd w:id="17"/>
+      <w:bookmarkStart w:id="16" w:name="_38xx50h8on8i" w:colFirst="0" w:colLast="0"/>
+      <w:bookmarkEnd w:id="16"/>
       <w:r>
         <w:rPr>
           <w:b/>
@@ -1329,10 +1326,7 @@
         <w:spacing w:before="240" w:after="240"/>
       </w:pPr>
       <w:r>
-        <w:t>The NLP model analyzes</w:t>
-      </w:r>
-      <w:r>
-        <w:t>:</w:t>
+        <w:t>The NLP model analyzes:</w:t>
       </w:r>
     </w:p>
     <w:p>
@@ -1390,8 +1384,8 @@
           <w:szCs w:val="34"/>
         </w:rPr>
       </w:pPr>
-      <w:bookmarkStart w:id="18" w:name="_urhcyynw0aaq" w:colFirst="0" w:colLast="0"/>
-      <w:bookmarkEnd w:id="18"/>
+      <w:bookmarkStart w:id="17" w:name="_urhcyynw0aaq" w:colFirst="0" w:colLast="0"/>
+      <w:bookmarkEnd w:id="17"/>
       <w:r>
         <w:rPr>
           <w:b/>
@@ -1416,8 +1410,8 @@
           <w:szCs w:val="26"/>
         </w:rPr>
       </w:pPr>
-      <w:bookmarkStart w:id="19" w:name="_9w9csfkxye0g" w:colFirst="0" w:colLast="0"/>
-      <w:bookmarkEnd w:id="19"/>
+      <w:bookmarkStart w:id="18" w:name="_9w9csfkxye0g" w:colFirst="0" w:colLast="0"/>
+      <w:bookmarkEnd w:id="18"/>
       <w:r>
         <w:rPr>
           <w:b/>
@@ -1489,8 +1483,8 @@
           <w:szCs w:val="26"/>
         </w:rPr>
       </w:pPr>
-      <w:bookmarkStart w:id="20" w:name="_k0kvgpwyftbl" w:colFirst="0" w:colLast="0"/>
-      <w:bookmarkEnd w:id="20"/>
+      <w:bookmarkStart w:id="19" w:name="_k0kvgpwyftbl" w:colFirst="0" w:colLast="0"/>
+      <w:bookmarkEnd w:id="19"/>
       <w:r>
         <w:rPr>
           <w:b/>
@@ -1563,8 +1557,8 @@
           <w:szCs w:val="26"/>
         </w:rPr>
       </w:pPr>
-      <w:bookmarkStart w:id="21" w:name="_cx1t403vp3ti" w:colFirst="0" w:colLast="0"/>
-      <w:bookmarkEnd w:id="21"/>
+      <w:bookmarkStart w:id="20" w:name="_cx1t403vp3ti" w:colFirst="0" w:colLast="0"/>
+      <w:bookmarkEnd w:id="20"/>
       <w:r>
         <w:rPr>
           <w:b/>
@@ -1626,10 +1620,7 @@
         </w:numPr>
       </w:pPr>
       <w:r>
-        <w:t>Fake investm</w:t>
-      </w:r>
-      <w:r>
-        <w:t>ent schemes</w:t>
+        <w:t>Fake investment schemes</w:t>
       </w:r>
     </w:p>
     <w:p>
@@ -1664,8 +1655,8 @@
           <w:szCs w:val="46"/>
         </w:rPr>
       </w:pPr>
-      <w:bookmarkStart w:id="22" w:name="_j6eo9jm73p5v" w:colFirst="0" w:colLast="0"/>
-      <w:bookmarkEnd w:id="22"/>
+      <w:bookmarkStart w:id="21" w:name="_j6eo9jm73p5v" w:colFirst="0" w:colLast="0"/>
+      <w:bookmarkEnd w:id="21"/>
       <w:r>
         <w:rPr>
           <w:b/>
@@ -1784,8 +1775,8 @@
           <w:szCs w:val="46"/>
         </w:rPr>
       </w:pPr>
-      <w:bookmarkStart w:id="23" w:name="_drhm05atmsam" w:colFirst="0" w:colLast="0"/>
-      <w:bookmarkEnd w:id="23"/>
+      <w:bookmarkStart w:id="22" w:name="_drhm05atmsam" w:colFirst="0" w:colLast="0"/>
+      <w:bookmarkEnd w:id="22"/>
       <w:r>
         <w:rPr>
           <w:b/>
@@ -1809,8 +1800,8 @@
           <w:szCs w:val="34"/>
         </w:rPr>
       </w:pPr>
-      <w:bookmarkStart w:id="24" w:name="_ggaeilcfpyur" w:colFirst="0" w:colLast="0"/>
-      <w:bookmarkEnd w:id="24"/>
+      <w:bookmarkStart w:id="23" w:name="_ggaeilcfpyur" w:colFirst="0" w:colLast="0"/>
+      <w:bookmarkEnd w:id="23"/>
       <w:r>
         <w:rPr>
           <w:b/>
@@ -1866,8 +1857,8 @@
           <w:szCs w:val="34"/>
         </w:rPr>
       </w:pPr>
-      <w:bookmarkStart w:id="25" w:name="_9tsu1fs3vscg" w:colFirst="0" w:colLast="0"/>
-      <w:bookmarkEnd w:id="25"/>
+      <w:bookmarkStart w:id="24" w:name="_9tsu1fs3vscg" w:colFirst="0" w:colLast="0"/>
+      <w:bookmarkEnd w:id="24"/>
       <w:r>
         <w:rPr>
           <w:b/>
@@ -1875,16 +1866,7 @@
           <w:sz w:val="34"/>
           <w:szCs w:val="34"/>
         </w:rPr>
-        <w:t>8.2 Detai</w:t>
-      </w:r>
-      <w:r>
-        <w:rPr>
-          <w:b/>
-          <w:bCs/>
-          <w:sz w:val="34"/>
-          <w:szCs w:val="34"/>
-        </w:rPr>
-        <w:t>led Report (Advanced View)</w:t>
+        <w:t>8.2 Detailed Report (Advanced View)</w:t>
       </w:r>
     </w:p>
     <w:p>
@@ -1972,8 +1954,8 @@
           <w:szCs w:val="46"/>
         </w:rPr>
       </w:pPr>
-      <w:bookmarkStart w:id="26" w:name="_oy64sp44gw0q" w:colFirst="0" w:colLast="0"/>
-      <w:bookmarkEnd w:id="26"/>
+      <w:bookmarkStart w:id="25" w:name="_oy64sp44gw0q" w:colFirst="0" w:colLast="0"/>
+      <w:bookmarkEnd w:id="25"/>
       <w:r>
         <w:rPr>
           <w:b/>
@@ -1997,8 +1979,8 @@
           <w:szCs w:val="34"/>
         </w:rPr>
       </w:pPr>
-      <w:bookmarkStart w:id="27" w:name="_mglcfz8gm4s5" w:colFirst="0" w:colLast="0"/>
-      <w:bookmarkEnd w:id="27"/>
+      <w:bookmarkStart w:id="26" w:name="_mglcfz8gm4s5" w:colFirst="0" w:colLast="0"/>
+      <w:bookmarkEnd w:id="26"/>
       <w:r>
         <w:rPr>
           <w:b/>
@@ -2068,8 +2050,8 @@
           <w:szCs w:val="34"/>
         </w:rPr>
       </w:pPr>
-      <w:bookmarkStart w:id="28" w:name="_90pe1es2js7p" w:colFirst="0" w:colLast="0"/>
-      <w:bookmarkEnd w:id="28"/>
+      <w:bookmarkStart w:id="27" w:name="_90pe1es2js7p" w:colFirst="0" w:colLast="0"/>
+      <w:bookmarkEnd w:id="27"/>
       <w:r>
         <w:rPr>
           <w:b/>
@@ -2136,8 +2118,8 @@
           <w:szCs w:val="34"/>
         </w:rPr>
       </w:pPr>
-      <w:bookmarkStart w:id="29" w:name="_4bdavta2j0ud" w:colFirst="0" w:colLast="0"/>
-      <w:bookmarkEnd w:id="29"/>
+      <w:bookmarkStart w:id="28" w:name="_4bdavta2j0ud" w:colFirst="0" w:colLast="0"/>
+      <w:bookmarkEnd w:id="28"/>
       <w:r>
         <w:rPr>
           <w:b/>
@@ -2169,10 +2151,7 @@
         <w:spacing w:after="240"/>
       </w:pPr>
       <w:r>
-        <w:t>User-contro</w:t>
-      </w:r>
-      <w:r>
-        <w:t>lled record deletion</w:t>
+        <w:t>User-controlled record deletion</w:t>
       </w:r>
     </w:p>
     <w:p>
@@ -2195,8 +2174,8 @@
           <w:szCs w:val="46"/>
         </w:rPr>
       </w:pPr>
-      <w:bookmarkStart w:id="30" w:name="_q4wy2v5qrca9" w:colFirst="0" w:colLast="0"/>
-      <w:bookmarkEnd w:id="30"/>
+      <w:bookmarkStart w:id="29" w:name="_q4wy2v5qrca9" w:colFirst="0" w:colLast="0"/>
+      <w:bookmarkEnd w:id="29"/>
       <w:r>
         <w:rPr>
           <w:b/>
@@ -2389,8 +2368,8 @@
           <w:szCs w:val="46"/>
         </w:rPr>
       </w:pPr>
-      <w:bookmarkStart w:id="31" w:name="_e8byjrjwuchh" w:colFirst="0" w:colLast="0"/>
-      <w:bookmarkEnd w:id="31"/>
+      <w:bookmarkStart w:id="30" w:name="_e8byjrjwuchh" w:colFirst="0" w:colLast="0"/>
+      <w:bookmarkEnd w:id="30"/>
       <w:r>
         <w:rPr>
           <w:b/>
@@ -2478,8 +2457,8 @@
           <w:szCs w:val="46"/>
         </w:rPr>
       </w:pPr>
-      <w:bookmarkStart w:id="32" w:name="_e0zq3ybyb7xn" w:colFirst="0" w:colLast="0"/>
-      <w:bookmarkEnd w:id="32"/>
+      <w:bookmarkStart w:id="31" w:name="_e0zq3ybyb7xn" w:colFirst="0" w:colLast="0"/>
+      <w:bookmarkEnd w:id="31"/>
       <w:r>
         <w:rPr>
           <w:b/>
@@ -2624,8 +2603,8 @@
           <w:szCs w:val="46"/>
         </w:rPr>
       </w:pPr>
-      <w:bookmarkStart w:id="33" w:name="_qunkvfxrtdmh" w:colFirst="0" w:colLast="0"/>
-      <w:bookmarkEnd w:id="33"/>
+      <w:bookmarkStart w:id="32" w:name="_qunkvfxrtdmh" w:colFirst="0" w:colLast="0"/>
+      <w:bookmarkEnd w:id="32"/>
       <w:r>
         <w:rPr>
           <w:b/>
@@ -2696,7 +2675,10 @@
         <w:t>Integration with telecom providers &amp; banks</w:t>
       </w:r>
     </w:p>
-    <w:p/>
+    <w:p>
+      <w:bookmarkStart w:id="33" w:name="_GoBack"/>
+      <w:bookmarkEnd w:id="33"/>
+    </w:p>
     <w:sectPr>
       <w:pgSz w:w="12240" w:h="15840"/>
       <w:pgMar w:top="1440" w:right="1440" w:bottom="1440" w:left="1440" w:header="720" w:footer="720" w:gutter="0"/>

</xml_diff>